<commit_message>
docs: update warranty quotation materials
</commit_message>
<xml_diff>
--- a/docs/business/2026-06-23-warranty-info-quotation.docx
+++ b/docs/business/2026-06-23-warranty-info-quotation.docx
@@ -72,7 +72,7 @@
                 <w:color w:val="1F2937"/>
                 <w:sz w:val="21"/>
               </w:rPr>
-              <w:t>本次报价用于新增移动端用户质保信息填写与展示、后台电池详情质保信息查看能力，形成用户绑定设备后的售后质保信息闭环。</w:t>
+              <w:t>本次报价用于新增移动端用户质保信息填写与展示、后台电池详情质保信息查看、激活后质保到期自动计算以及单台电池质保时长维护能力。</w:t>
             </w:r>
           </w:p>
         </w:tc>
@@ -116,7 +116,7 @@
           <w:color w:val="000000"/>
           <w:sz w:val="22"/>
         </w:rPr>
-        <w:t>客户希望在富嘉云平台移动端新增用户质保信息能力：用户初次绑定电池设备后，可填写自己的质保联系人信息，包括姓名、联系电话，便于后续维修、保养和售后服务跟进。</w:t>
+        <w:t>客户希望在富嘉云平台移动端新增用户质保信息能力：用户初次绑定电池设备后，可填写自己的质保联系人信息，包括姓名、联系电话，便于后续维修、保养和售后服务跟进。考虑 APP 存在国外使用场景，移动端质保信息仅做引导填写，不作为用户继续使用 APP 或小程序的强制条件。</w:t>
       </w:r>
     </w:p>
     <w:p>
@@ -130,7 +130,7 @@
           <w:color w:val="000000"/>
           <w:sz w:val="22"/>
         </w:rPr>
-        <w:t>同时，WEB 后台需要在 BMS 管理的电池详情页补充质保信息查看能力，方便管理人员在查看单个电池时同步了解该电池绑定用户、用户填写的质保信息、激活日期和质保截止日期。</w:t>
+        <w:t>同时，WEB 后台需要在 BMS 管理的电池详情页补充质保信息查看能力，方便管理人员在查看单个电池时同步了解该电池绑定用户、用户填写的质保信息、激活日期和质保截止日期。云平台端在电池激活后自动计算质保到期时间，并支持后台针对单台电池单独修改质保时长，以满足多设备质保年限不统一的业务情况。</w:t>
       </w:r>
     </w:p>
     <w:p>
@@ -144,7 +144,7 @@
           <w:color w:val="000000"/>
           <w:sz w:val="22"/>
         </w:rPr>
-        <w:t>本次开发目标是在现有移动端和后台管理基础上补充质保信息闭环，不改变现有电池绑定、激活和质保计算主流程。</w:t>
+        <w:t>本次开发目标是在现有移动端和后台管理基础上补充质保信息闭环，并在现有电池激活逻辑上补充质保到期日期计算与单台设备质保时长维护能力。</w:t>
       </w:r>
     </w:p>
     <w:p>
@@ -356,7 +356,7 @@
                 <w:rFonts w:ascii="Calibri" w:hAnsi="Calibri" w:eastAsia="Microsoft YaHei"/>
                 <w:sz w:val="20"/>
               </w:rPr>
-              <w:t>在移动端“我的”页面新增“质保信息”菜单入口；进入后展示当前用户质保基本信息、已关联电池质保卡片；未填写姓名、联系电话时引导用户补充填写</w:t>
+              <w:t>在移动端“我的”页面新增“质保信息”菜单入口；进入后展示当前用户质保基本信息、已关联电池质保卡片；未填写姓名、联系电话时做引导提示，但不强制填写、不阻断用户继续使用</w:t>
             </w:r>
           </w:p>
         </w:tc>
@@ -430,7 +430,7 @@
                 <w:rFonts w:ascii="Calibri" w:hAnsi="Calibri" w:eastAsia="Microsoft YaHei"/>
                 <w:sz w:val="20"/>
               </w:rPr>
-              <w:t>支持用户维护本人姓名、联系电话；完成表单校验、保存接口对接、保存成功后的页面回显与状态刷新</w:t>
+              <w:t>支持用户维护本人姓名、联系电话；完成表单校验、保存接口对接、保存成功后的页面回显与状态刷新；用户可跳过填写</w:t>
             </w:r>
           </w:p>
         </w:tc>
@@ -504,7 +504,7 @@
                 <w:rFonts w:ascii="Calibri" w:hAnsi="Calibri" w:eastAsia="Microsoft YaHei"/>
                 <w:sz w:val="20"/>
               </w:rPr>
-              <w:t>展示用户已绑定电池的质保卡片信息，包括电池序列号、激活日期、质保截止日期；无绑定电池或无质保数据时提供空状态提示</w:t>
+              <w:t>展示用户已绑定电池的质保卡片信息，包括电池序列号、激活日期、质保截止日期；无绑定电池、未填写质保信息或无质保数据时提供空状态提示</w:t>
             </w:r>
           </w:p>
         </w:tc>
@@ -578,7 +578,7 @@
                 <w:rFonts w:ascii="Calibri" w:hAnsi="Calibri" w:eastAsia="Microsoft YaHei"/>
                 <w:sz w:val="20"/>
               </w:rPr>
-              <w:t>新增/扩展用户质保信息存储与接口能力，支持移动端查询、保存用户质保信息，并返回用户关联电池质保列表</w:t>
+              <w:t>新增/扩展用户质保信息存储与接口能力；电池激活后自动计算质保截止日期；支持移动端查询、保存用户质保信息，并返回用户关联电池质保列表</w:t>
             </w:r>
           </w:p>
         </w:tc>
@@ -652,7 +652,7 @@
                 <w:rFonts w:ascii="Calibri" w:hAnsi="Calibri" w:eastAsia="Microsoft YaHei"/>
                 <w:sz w:val="20"/>
               </w:rPr>
-              <w:t>在后台管理 “BMS 管理 &gt; 电池列表 &gt; 电池详情” 中新增“质保”Tab，展示该电池关联绑定用户基本信息、用户填写的质保信息、激活日期和质保截止日期</w:t>
+              <w:t>在后台管理 “BMS 管理 &gt; 电池列表 &gt; 电池详情” 中新增“质保”Tab，展示该电池关联绑定用户基本信息、用户填写的质保信息、激活日期、质保截止日期，并支持单台电池质保时长单独修改</w:t>
             </w:r>
           </w:p>
         </w:tc>
@@ -897,7 +897,7 @@
           <w:rFonts w:ascii="Calibri" w:hAnsi="Calibri" w:eastAsia="Microsoft YaHei"/>
           <w:sz w:val="22"/>
         </w:rPr>
-        <w:t>如果用户未填写质保基本信息，页面展示引导填写入口。</w:t>
+        <w:t>如果用户未填写质保基本信息，页面展示引导填写入口，但不强制填写，不影响继续使用 APP 或小程序其他功能。</w:t>
       </w:r>
     </w:p>
     <w:p>
@@ -910,7 +910,7 @@
           <w:rFonts w:ascii="Calibri" w:hAnsi="Calibri" w:eastAsia="Microsoft YaHei"/>
           <w:sz w:val="22"/>
         </w:rPr>
-        <w:t>用户可填写或更新本人质保信息。</w:t>
+        <w:t>用户可填写、跳过或后续更新本人质保信息。</w:t>
       </w:r>
     </w:p>
     <w:p>
@@ -958,7 +958,67 @@
         <w:pStyle w:val="Heading2"/>
       </w:pPr>
       <w:r>
-        <w:t>3.2 WEB 后台功能</w:t>
+        <w:t>3.2 云平台质保计算与维护</w:t>
+      </w:r>
+    </w:p>
+    <w:p>
+      <w:pPr>
+        <w:pStyle w:val="ListNumber"/>
+        <w:spacing w:after="80" w:line="264" w:lineRule="auto"/>
+      </w:pPr>
+      <w:r>
+        <w:rPr>
+          <w:rFonts w:ascii="Calibri" w:hAnsi="Calibri" w:eastAsia="Microsoft YaHei"/>
+          <w:sz w:val="22"/>
+        </w:rPr>
+        <w:t>电池激活后，云平台根据激活日期自动计算质保截止日期。</w:t>
+      </w:r>
+    </w:p>
+    <w:p>
+      <w:pPr>
+        <w:pStyle w:val="ListNumber"/>
+        <w:spacing w:after="80" w:line="264" w:lineRule="auto"/>
+      </w:pPr>
+      <w:r>
+        <w:rPr>
+          <w:rFonts w:ascii="Calibri" w:hAnsi="Calibri" w:eastAsia="Microsoft YaHei"/>
+          <w:sz w:val="22"/>
+        </w:rPr>
+        <w:t>后台支持针对单台电池单独修改质保时长。</w:t>
+      </w:r>
+    </w:p>
+    <w:p>
+      <w:pPr>
+        <w:pStyle w:val="ListNumber"/>
+        <w:spacing w:after="80" w:line="264" w:lineRule="auto"/>
+      </w:pPr>
+      <w:r>
+        <w:rPr>
+          <w:rFonts w:ascii="Calibri" w:hAnsi="Calibri" w:eastAsia="Microsoft YaHei"/>
+          <w:sz w:val="22"/>
+        </w:rPr>
+        <w:t>系统支持不同设备使用不同质保年限，不要求所有设备质保年限统一。</w:t>
+      </w:r>
+    </w:p>
+    <w:p>
+      <w:pPr>
+        <w:pStyle w:val="ListNumber"/>
+        <w:spacing w:after="80" w:line="264" w:lineRule="auto"/>
+      </w:pPr>
+      <w:r>
+        <w:rPr>
+          <w:rFonts w:ascii="Calibri" w:hAnsi="Calibri" w:eastAsia="Microsoft YaHei"/>
+          <w:sz w:val="22"/>
+        </w:rPr>
+        <w:t>修改单台电池质保时长后，该电池质保截止日期同步更新，并在移动端质保卡片和后台电池详情中展示。</w:t>
+      </w:r>
+    </w:p>
+    <w:p>
+      <w:pPr>
+        <w:pStyle w:val="Heading2"/>
+      </w:pPr>
+      <w:r>
+        <w:t>3.3 WEB 后台功能</w:t>
       </w:r>
     </w:p>
     <w:p>
@@ -998,7 +1058,20 @@
           <w:color w:val="000000"/>
           <w:sz w:val="22"/>
         </w:rPr>
-        <w:t>- 绑定用户基本信息 - 用户填写的质保姓名 - 用户填写的质保联系电话 - 电池激活日期 - 电池质保截止日期</w:t>
+        <w:t>- 绑定用户基本信息 - 用户填写的质保姓名 - 用户填写的质保联系电话 - 电池激活日期 - 电池质保截止日期 - 当前质保时长</w:t>
+      </w:r>
+    </w:p>
+    <w:p>
+      <w:pPr>
+        <w:pStyle w:val="ListNumber"/>
+        <w:spacing w:after="80" w:line="264" w:lineRule="auto"/>
+      </w:pPr>
+      <w:r>
+        <w:rPr>
+          <w:rFonts w:ascii="Calibri" w:hAnsi="Calibri" w:eastAsia="Microsoft YaHei"/>
+          <w:sz w:val="22"/>
+        </w:rPr>
+        <w:t>支持后台人员单独调整当前电池的质保时长，用于处理不同设备质保年限不统一的情况。</w:t>
       </w:r>
     </w:p>
     <w:p>
@@ -1194,7 +1267,7 @@
                 <w:rFonts w:ascii="Calibri" w:hAnsi="Calibri" w:eastAsia="Microsoft YaHei"/>
                 <w:sz w:val="20"/>
               </w:rPr>
-              <w:t>完成用户质保信息存储、查询、保存接口及电池质保数据返回</w:t>
+              <w:t>完成用户质保信息存储、查询、保存接口、电池激活后质保到期计算及电池质保数据返回</w:t>
             </w:r>
           </w:p>
         </w:tc>
@@ -1306,7 +1379,7 @@
                 <w:rFonts w:ascii="Calibri" w:hAnsi="Calibri" w:eastAsia="Microsoft YaHei"/>
                 <w:sz w:val="20"/>
               </w:rPr>
-              <w:t>完成电池详情页质保信息展示</w:t>
+              <w:t>完成电池详情页质保信息展示和单台电池质保时长修改</w:t>
             </w:r>
           </w:p>
         </w:tc>
@@ -1418,7 +1491,7 @@
           <w:rFonts w:ascii="Calibri" w:hAnsi="Calibri" w:eastAsia="Microsoft YaHei"/>
           <w:sz w:val="22"/>
         </w:rPr>
-        <w:t>用户质保基本信息填写、保存和回显能力。</w:t>
+        <w:t>用户质保基本信息填写、保存和回显能力；移动端仅引导填写，不强制填写。</w:t>
       </w:r>
     </w:p>
     <w:p>
@@ -1432,6 +1505,19 @@
           <w:sz w:val="22"/>
         </w:rPr>
         <w:t>用户关联电池质保卡片展示。</w:t>
+      </w:r>
+    </w:p>
+    <w:p>
+      <w:pPr>
+        <w:pStyle w:val="ListNumber"/>
+        <w:spacing w:after="80" w:line="264" w:lineRule="auto"/>
+      </w:pPr>
+      <w:r>
+        <w:rPr>
+          <w:rFonts w:ascii="Calibri" w:hAnsi="Calibri" w:eastAsia="Microsoft YaHei"/>
+          <w:sz w:val="22"/>
+        </w:rPr>
+        <w:t>电池激活后的质保截止日期自动计算能力。</w:t>
       </w:r>
     </w:p>
     <w:p>
@@ -1458,6 +1544,19 @@
           <w:sz w:val="22"/>
         </w:rPr>
         <w:t>WEB 后台电池详情“质保”Tab。</w:t>
+      </w:r>
+    </w:p>
+    <w:p>
+      <w:pPr>
+        <w:pStyle w:val="ListNumber"/>
+        <w:spacing w:after="80" w:line="264" w:lineRule="auto"/>
+      </w:pPr>
+      <w:r>
+        <w:rPr>
+          <w:rFonts w:ascii="Calibri" w:hAnsi="Calibri" w:eastAsia="Microsoft YaHei"/>
+          <w:sz w:val="22"/>
+        </w:rPr>
+        <w:t>WEB 后台单台电池质保时长修改能力，支持多设备质保年限不统一。</w:t>
       </w:r>
     </w:p>
     <w:p>
@@ -1518,7 +1617,7 @@
           <w:rFonts w:ascii="Calibri" w:hAnsi="Calibri" w:eastAsia="Microsoft YaHei"/>
           <w:sz w:val="22"/>
         </w:rPr>
-        <w:t>不包含质保规则的复杂配置化，例如按不同客户、型号、批次配置不同质保年限；本次默认复用现有电池质保数据或现有系统计算结果。</w:t>
+        <w:t>不包含质保规则的复杂批量配置化，例如按不同客户、型号、批次自动套用不同质保年限；本次仅包含电池激活后默认计算质保截止日期，以及后台对单台电池单独修改质保时长。</w:t>
       </w:r>
     </w:p>
     <w:p>
@@ -1571,7 +1670,7 @@
           <w:color w:val="000000"/>
           <w:sz w:val="22"/>
         </w:rPr>
-        <w:t>如客户后续需要扩展售后工单、质保规则配置、到期提醒、批量导入或统计报表，可在本次功能基础上另行评估。</w:t>
+        <w:t>如客户后续需要扩展售后工单、按客户/型号/批次的质保规则配置、到期提醒、批量导入或统计报表，可在本次功能基础上另行评估。</w:t>
       </w:r>
     </w:p>
     <w:p>

</xml_diff>